<commit_message>
Tuning em duas janelas, Weibull AFT e limiar custo-ótimo em R$
Três avanços metodológicos, todos escolhidos na validação e congelados
antes do teste:

- Tuning walk-forward em duas janelas (jan-mar→abr e jan-abr→mai) com
  seleção pela média de AP; target encodings recuados para jan-mar,
  eliminando vazamento nas janelas de tuning.
- Abordagem de sobrevivência: Weibull AFT (lifelines) com censura à
  direita — C-index 0,781, risco em 4 h com AUC-ROC 0,841, fatores de
  aceleração convergentes com o SHAP do classificador.
- Segundo ponto de operação custo-ótimo: limiar que maximiza o benefício
  líquido sob as premissas financeiras explícitas — R$ 1,10 mi/mês com
  precisão de 41,9% (ponto F2: 68,6% de antecipação).

Teste cego (jun/2025): LightGBM AUC-ROC 0,870 / F2 0,414; RF AUC-PR 0,320.
Relatório, README, figuras e 17 tabelas atualizados.

Co-Authored-By: Claude Fable 5 <noreply@anthropic.com>
</commit_message>
<xml_diff>
--- a/relatorio/Relatorio_Final.docx
+++ b/relatorio/Relatorio_Final.docx
@@ -98,7 +98,34 @@
         <w:t>Resumo.</w:t>
       </w:r>
       <w:r>
-        <w:t xml:space="preserve"> Este trabalho aborda a antecipação de alertas críticos de condição ("don't go") em uma frota de 47 equipamentos de mina em Itabira — caminhões fora de estrada CAT 793-D (frotas 2S a 5S) e escavadeiras LeTourneau L-1850 — a partir de duas fontes: os apontamentos de ciclo operacional (377.907 registros) e a telemetria embarcada (37,16 milhões de eventos), cobrindo seis meses de operação (jan a jun/2025). O catálogo de regras de negócio (151 regras TIPO + EVENTO + SITUACAO + QTD + TEMPO + NIVEL) foi convertido em um motor de regras em Python que rotulou 1.974 alertas don't go no período. O problema foi formulado como classificação binária: prever, ao fim de cada ciclo de apontamento, se o equipamento disparará um alerta don't go nas 4 horas seguintes — janela definida pelo tempo necessário para o despacho retirar o equipamento de rota e a manutenção preparar box, peças e equipe. Após limpeza com controle de alterações (todas as decisões documentadas, incluindo a derivação do operador por casamento temporal com a telemetria), foram construídas 50 features de janelas retroativas (contagens de eventos por criticidade em 4/12/24/72 h, "quase-gatilhos" das regras, tempos desde o último evento crítico, utilização, encodings de frota, operador e equipamento), gerando uma tabela analítica com 343.663 pontos de decisão e prevalência de 4,89%. A validação foi estritamente temporal (treino jan–abr/2025; validação mai/2025 para tuning e limiar; teste jun/2025 tocado uma única vez). Três modelos supervisionados foram comparados contra dois baselines, além de uma abordagem não supervisionada (Isolation Forest e K-Means). O LightGBM venceu com AUC-ROC 0,864 e AUC-PR 0,317 no teste — 30% acima do AUC-PR da heurística de despacho (0,245) e 9,6 vezes a prevalência —, entregando recall de 46,3% e precisão de 24,5% no limiar operacional (F2). Em termos de negócio: 60,7% dos 229 alertas de junho foram antecipados com mediana de 3,2 h de antecedência, o equivalente a ~327 h de parada não planejada evitável e benefício líquido estimado de R$ 805 mil no mês. A análise SHAP confirmou que o modelo aprendeu a física do problema (recorrência de alertas e rajadas de alarmes monitorados em janelas curtas dominam o risco), e a análise de erros revelou dois achados centrais: a frota L-1850 gera 91% do volume de telemetria mas apenas 1,2% dos alertas — e é justamente a mais imprevisível (100% de falsos negativos) —, e o desempenho do ranking oscila com a prevalência quinzenal, reforçando a necessidade de re-treino frequente em produção.</w:t>
+        <w:t xml:space="preserve"> Este trabalho aborda a antecipação de alertas críticos de condição ("don't go") em uma frota de 47 equipamentos de mina em Itabira — caminhões fora de estrada CAT 793-D (frotas 2S a 5S) e escavadeiras LeTourneau L-1850 — a partir de duas fontes: os apontamentos de ciclo operacional (377.907 registros) e a telemetria embarcada (37,16 milhões de eventos), cobrindo seis meses de operação (jan a jun/2025). O catálogo de regras de negócio (151 regras TIPO + EVENTO + SITUACAO + QTD + TEMPO + NIVEL) foi convertido em um motor de regras em Python que rotulou 1.974 alertas don't go no período. O problema foi formulado como classificação binária — prever, ao fim de cada ciclo de apontamento, se o equipamento disparará um alerta don't go nas 4 horas seguintes — complementada por uma formulação de sobrevivência (Weibull AFT com censura à direita) que estima o tempo até o próximo alerta. Após limpeza com controle de alterações (todas as decisões documentadas, incluindo a derivação do operador por casamento temporal com a telemetria), foram construídas 50 features de janelas retroativas, gerando uma tabela analítica com 343.663 pontos de decisão e prevalência de 4,89%. A validação foi estritamente temporal (treino jan–abr/2025; teste jun/2025 tocado uma única vez), com tuning em </w:t>
+      </w:r>
+      <w:r>
+        <w:rPr>
+          <w:b/>
+        </w:rPr>
+        <w:t>duas janelas independentes</w:t>
+      </w:r>
+      <w:r>
+        <w:t xml:space="preserve"> (abr e mai) e encodings estimados apenas em jan–mar — nenhuma estatística vê dados de validação. Três classificadores foram comparados contra dois baselines, além do modelo de sobrevivência e de uma abordagem não supervisionada (Isolation Forest e K-Means). O LightGBM venceu a seleção pré-registrada com AUC-ROC 0,870 no teste (Random Forest: AUC-PR 0,320, empate técnico; heurística de despacho: 0,750/0,245; Weibull AFT: C-index 0,781). O modelo é operado em </w:t>
+      </w:r>
+      <w:r>
+        <w:rPr>
+          <w:b/>
+        </w:rPr>
+        <w:t>dois pontos de limiar escolhidos na validação</w:t>
+      </w:r>
+      <w:r>
+        <w:t xml:space="preserve">: o ponto de captura (F2) antecipa 68,6% dos 229 alertas de junho com mediana de 3,3 h de aviso, e o ponto custo-ótimo — que maximiza o benefício líquido sob as premissas financeiras explícitas — antecipa 45% com precisão de 42% e </w:t>
+      </w:r>
+      <w:r>
+        <w:rPr>
+          <w:b/>
+        </w:rPr>
+        <w:t>benefício líquido estimado de R$ 1,10 milhão no mês</w:t>
+      </w:r>
+      <w:r>
+        <w:t>. A análise SHAP confirmou que o modelo aprendeu a física do problema (recorrência de alertas e rajadas de alarmes monitorados dominam o risco), e a análise de erros revelou achados acionáveis: a frota L-1850 gera 91% do volume de telemetria mas apenas 1,2% dos alertas — e é a única 100% imprevisível —, e o precursor de temperatura de freio existe no eixo dianteiro (94% de recall) mas é fraco no traseiro (~33%), um mapa direto para melhorias de instrumentação.</w:t>
       </w:r>
     </w:p>
     <w:p>
@@ -112,7 +139,7 @@
         <w:t>Palavras-chave:</w:t>
       </w:r>
       <w:r>
-        <w:t xml:space="preserve"> manutenção preditiva; telemetria industrial; alertas don't go; LightGBM; validação temporal; SHAP; mineração.</w:t>
+        <w:t xml:space="preserve"> manutenção preditiva; telemetria industrial; alertas don't go; LightGBM; análise de sobrevivência; validação temporal; SHAP; mineração.</w:t>
       </w:r>
     </w:p>
     <w:p>
@@ -815,7 +842,7 @@
         <w:jc w:val="both"/>
       </w:pPr>
       <w:r>
-        <w:t xml:space="preserve">O pipeline foi implementado em Python 3 (pandas, scikit-learn, LightGBM, SHAP) e organizado em módulos com responsabilidade única, executáveis de ponta a ponta por </w:t>
+        <w:t xml:space="preserve">O pipeline foi implementado em Python 3 (pandas, scikit-learn, LightGBM, lifelines, SHAP) e organizado em módulos com responsabilidade única, executáveis de ponta a ponta por </w:t>
       </w:r>
       <w:r>
         <w:rPr>
@@ -4202,7 +4229,13 @@
                 <w:b/>
                 <w:sz w:val="16"/>
               </w:rPr>
-              <w:t>estimado só no treino</w:t>
+              <w:t>estimado só em jan–mar</w:t>
+            </w:r>
+            <w:r>
+              <w:rPr>
+                <w:sz w:val="16"/>
+              </w:rPr>
+              <w:t xml:space="preserve"> (anterior a todas as janelas de validação)</w:t>
             </w:r>
           </w:p>
         </w:tc>
@@ -4253,7 +4286,7 @@
         <w:t>Operador</w:t>
       </w:r>
       <w:r>
-        <w:t xml:space="preserve"> (alta cardinalidade), estimado exclusivamente no período de treino para evitar vazamento; </w:t>
+        <w:t xml:space="preserve"> (alta cardinalidade), estimado exclusivamente em jan–mar/2025 — anterior às duas janelas de tuning e ao teste — para evitar qualquer vazamento; </w:t>
       </w:r>
       <w:r>
         <w:rPr>
@@ -4440,7 +4473,7 @@
         <w:rPr>
           <w:b/>
         </w:rPr>
-        <w:t>treino = 01/01/2025 a 30/04/2025</w:t>
+        <w:t>treino final = 01/01/2025 a 30/04/2025</w:t>
       </w:r>
       <w:r>
         <w:t xml:space="preserve"> (230.009 pontos, 66,9%, prevalência 5,72%); </w:t>
@@ -4452,7 +4485,7 @@
         <w:t>validação = mai/2025</w:t>
       </w:r>
       <w:r>
-        <w:t xml:space="preserve"> (58.954 pontos, 17,2%, 3,14%) — usada para tuning de hiperparâmetros e escolha de limiar; </w:t>
+        <w:t xml:space="preserve"> (58.954 pontos, 17,2%, 3,14%) — usada para escolha dos limiares de operação; </w:t>
       </w:r>
       <w:r>
         <w:rPr>
@@ -4470,7 +4503,39 @@
         <w:t>uma única vez</w:t>
       </w:r>
       <w:r>
-        <w:t>, com limiar congelado. Nenhuma estatística (encodings, escalas, hiperparâmetros) foi estimada fora do treino.</w:t>
+        <w:t>, com limiares congelados.</w:t>
+      </w:r>
+    </w:p>
+    <w:p>
+      <w:pPr>
+        <w:jc w:val="both"/>
+      </w:pPr>
+      <w:r>
+        <w:rPr>
+          <w:b/>
+        </w:rPr>
+        <w:t>Tuning em duas janelas.</w:t>
+      </w:r>
+      <w:r>
+        <w:t xml:space="preserve"> Um único mês de validação pode eleger hiperparâmetros ajustados às idiossincrasias daquele mês — e maio muda de regime na 2ª quinzena (a prevalência cai de 3,9% para 2,5%; seção 4.2). Por isso cada configuração candidata foi avaliada em </w:t>
+      </w:r>
+      <w:r>
+        <w:rPr>
+          <w:b/>
+        </w:rPr>
+        <w:t>duas janelas walk-forward independentes</w:t>
+      </w:r>
+      <w:r>
+        <w:t xml:space="preserve"> — (treino jan–mar → validação abr) e (treino jan–abr → validação mai) — e a seleção usou a </w:t>
+      </w:r>
+      <w:r>
+        <w:rPr>
+          <w:b/>
+        </w:rPr>
+        <w:t>média do average precision</w:t>
+      </w:r>
+      <w:r>
+        <w:t xml:space="preserve"> das duas. Para eliminar vazamento nas duas janelas, os target encodings de equipamento e operador foram estimados apenas em jan–mar. Nenhuma estatística (encodings, escalas, hiperparâmetros) viu dados de validação ou teste.</w:t>
       </w:r>
     </w:p>
     <w:p>
@@ -4568,7 +4633,7 @@
         <w:t>Abordagem 1 — supervisionada (classificação).</w:t>
       </w:r>
       <w:r>
-        <w:t xml:space="preserve"> Três famílias com complexidade crescente:</w:t>
+        <w:t xml:space="preserve"> Três famílias com complexidade crescente, todas selecionadas pela média de AP nas duas janelas de tuning:</w:t>
       </w:r>
     </w:p>
     <w:p>
@@ -4582,7 +4647,7 @@
         <w:t>Regressão Logística</w:t>
       </w:r>
       <w:r>
-        <w:t xml:space="preserve"> (StandardScaler + class_weight=balanced; C ∈ {0,01; 0,1; 1; 10} escolhido na validação → C=0,01). Papel: fronteira linear interpretável.</w:t>
+        <w:t xml:space="preserve"> (StandardScaler + class_weight=balanced; C ∈ {0,01; 0,1; 1; 10} → C=0,1). Papel: fronteira linear interpretável.</w:t>
       </w:r>
     </w:p>
     <w:p>
@@ -4619,7 +4684,7 @@
         <w:t>busca aleatória com 30 configurações</w:t>
       </w:r>
       <w:r>
-        <w:t xml:space="preserve"> sobre num_leaves {15–127}, learning_rate log-uniforme [0,01; 0,2], min_child_samples {10–200}, feature_fraction e bagging_fraction [0,6; 1,0], regularizações L1/L2 log-uniformes e scale_pos_weight {1, √16,5; 16,5}, com early stopping (60 rodadas) monitorando average precision na validação. Configuração vencedora: num_leaves=63, learning_rate=0,011, min_child_samples=10, feature_fraction=0,73, bagging_fraction=0,66, scale_pos_weight=√16,5≈4,1 e apenas </w:t>
+        <w:t xml:space="preserve"> sobre num_leaves {15–127}, learning_rate log-uniforme [0,01; 0,2], min_child_samples {10–200}, feature_fraction e bagging_fraction [0,6; 1,0], regularizações L1/L2 log-uniformes e scale_pos_weight {1; √16,5; 16,5}, com early stopping (60 rodadas) monitorando average precision. Configuração vencedora (AP médio 0,223): num_leaves=31, learning_rate=0,011, min_child_samples=10, feature_fraction=0,75, bagging_fraction=0,93, reg_alpha=1,71, scale_pos_weight=√16,5≈4,1 e apenas </w:t>
       </w:r>
       <w:r>
         <w:rPr>
@@ -4628,7 +4693,7 @@
         <w:t>3 árvores</w:t>
       </w:r>
       <w:r>
-        <w:t xml:space="preserve"> — o early stopping interrompeu cedo porque a validação (maio) sofre queda de prevalência na 2ª quinzena (seção 4.2), e modelos maiores se ajustavam a padrões que não persistem. O modelo final é compacto mas foi o melhor da busca tanto na validação quanto, verificado a posteriori, no teste. A seleção por AUC-PR (e não accuracy/AUC-ROC) é deliberada: com ~5% de positivos, é a métrica que discrimina modelos na região operacional.</w:t>
+        <w:t xml:space="preserve"> — mesmo com duas janelas, a busca convergiu para um modelo compacto: com features de janela retroativa já muito informativas, poucas árvores capturam o sinal estável entre regimes, e modelos maiores se ajustam a padrões que não persistem de um mês para o outro. A seleção por AUC-PR (e não accuracy/AUC-ROC) é deliberada: com ~5% de positivos, é a métrica que discrimina modelos na região operacional.</w:t>
       </w:r>
     </w:p>
     <w:p>
@@ -4639,7 +4704,67 @@
         <w:rPr>
           <w:b/>
         </w:rPr>
-        <w:t>Abordagem 2 — não supervisionada.</w:t>
+        <w:t>Abordagem 2 — sobrevivência (Weibull AFT).</w:t>
+      </w:r>
+      <w:r>
+        <w:t xml:space="preserve"> Em vez de "haverá alerta em 4 h?", o modelo de tempo de falha acelerado pergunta </w:t>
+      </w:r>
+      <w:r>
+        <w:rPr>
+          <w:b/>
+        </w:rPr>
+        <w:t>"quanto tempo até o próximo alerta?"</w:t>
+      </w:r>
+      <w:r>
+        <w:t xml:space="preserve">. Cada ponto de decisão vira uma observação com duração T (horas até o próximo don't go) e indicador de evento; pontos sem alerta observado são </w:t>
+      </w:r>
+      <w:r>
+        <w:rPr>
+          <w:b/>
+        </w:rPr>
+        <w:t>censurados à direita</w:t>
+      </w:r>
+      <w:r>
+        <w:t xml:space="preserve"> (fim da base em 30/06 ou teto de 21 dias) — ignorar a censura enviesaria qualquer regressão simples de tempo, e é exatamente o problema que a formulação de sobrevivência resolve. Implementação: </w:t>
+      </w:r>
+      <w:r>
+        <w:rPr>
+          <w:rFonts w:ascii="Consolas" w:hAnsi="Consolas"/>
+          <w:sz w:val="18"/>
+        </w:rPr>
+        <w:t>WeibullAFTFitter</w:t>
+      </w:r>
+      <w:r>
+        <w:t xml:space="preserve"> (lifelines, penalizer=0,01) sobre as 16 features de maior sinal, padronizadas no treino; 155.754 eventos observados em 230.009 observações de treino. O modelo produz duas saídas: o </w:t>
+      </w:r>
+      <w:r>
+        <w:rPr>
+          <w:b/>
+        </w:rPr>
+        <w:t>risco acumulado em 4 h</w:t>
+      </w:r>
+      <w:r>
+        <w:t xml:space="preserve"> (1 − S(4|x)), diretamente comparável aos classificadores, e os </w:t>
+      </w:r>
+      <w:r>
+        <w:rPr>
+          <w:b/>
+        </w:rPr>
+        <w:t>fatores de aceleração</w:t>
+      </w:r>
+      <w:r>
+        <w:t xml:space="preserve"> exp(coef) por desvio-padrão — interpretabilidade nativa (seção 4.4).</w:t>
+      </w:r>
+    </w:p>
+    <w:p>
+      <w:pPr>
+        <w:jc w:val="both"/>
+      </w:pPr>
+      <w:r>
+        <w:rPr>
+          <w:b/>
+        </w:rPr>
+        <w:t>Abordagem 3 — não supervisionada.</w:t>
       </w:r>
       <w:r>
         <w:t xml:space="preserve"> (a) </w:t>
@@ -4748,16 +4873,25 @@
         <w:t>custo dos erros é assimétrico</w:t>
       </w:r>
       <w:r>
-        <w:t xml:space="preserve">: um falso negativo é uma parada não planejada (horas de máquina, risco de dano secundário e de segurança); um falso positivo é ~1 h de inspeção. Por isso o limiar de operação foi escolhido na validação </w:t>
+        <w:t xml:space="preserve">: um falso negativo é uma parada não planejada (horas de máquina, risco de dano secundário e de segurança); um falso positivo é ~1 h de inspeção. O modelo campeão opera em </w:t>
       </w:r>
       <w:r>
         <w:rPr>
           <w:b/>
         </w:rPr>
-        <w:t>maximizando F2</w:t>
-      </w:r>
-      <w:r>
-        <w:t xml:space="preserve"> (recall pesa o dobro da precisão) — o ponto da curva Precision-Recall coerente com esse custo.</w:t>
+        <w:t>dois limiares escolhidos na validação</w:t>
+      </w:r>
+      <w:r>
+        <w:t xml:space="preserve">: o ponto F2 (recall pesa o dobro da precisão — prioriza captura) e o ponto </w:t>
+      </w:r>
+      <w:r>
+        <w:rPr>
+          <w:b/>
+        </w:rPr>
+        <w:t>custo-ótimo</w:t>
+      </w:r>
+      <w:r>
+        <w:t>, que maximiza o benefício líquido estimado em R$ sob as premissas financeiras explícitas (seção 4.6).</w:t>
       </w:r>
     </w:p>
     <w:tbl>
@@ -5179,7 +5313,7 @@
               <w:rPr>
                 <w:sz w:val="16"/>
               </w:rPr>
-              <w:t>0,098</w:t>
+              <w:t>0,107</w:t>
             </w:r>
           </w:p>
         </w:tc>
@@ -5192,7 +5326,7 @@
               <w:rPr>
                 <w:sz w:val="16"/>
               </w:rPr>
-              <w:t>0,658</w:t>
+              <w:t>0,624</w:t>
             </w:r>
           </w:p>
         </w:tc>
@@ -5205,7 +5339,7 @@
               <w:rPr>
                 <w:sz w:val="16"/>
               </w:rPr>
-              <w:t>0,171</w:t>
+              <w:t>0,183</w:t>
             </w:r>
           </w:p>
         </w:tc>
@@ -5218,7 +5352,7 @@
               <w:rPr>
                 <w:sz w:val="16"/>
               </w:rPr>
-              <w:t>0,307</w:t>
+              <w:t>0,318</w:t>
             </w:r>
           </w:p>
         </w:tc>
@@ -5231,7 +5365,7 @@
               <w:rPr>
                 <w:sz w:val="16"/>
               </w:rPr>
-              <w:t>0,840</w:t>
+              <w:t>0,847</w:t>
             </w:r>
           </w:p>
         </w:tc>
@@ -5244,7 +5378,7 @@
               <w:rPr>
                 <w:sz w:val="16"/>
               </w:rPr>
-              <w:t>0,269</w:t>
+              <w:t>0,279</w:t>
             </w:r>
           </w:p>
         </w:tc>
@@ -5257,7 +5391,7 @@
               <w:rPr>
                 <w:sz w:val="16"/>
               </w:rPr>
-              <w:t>C=0,01, balanced</w:t>
+              <w:t>C=0,1, balanced</w:t>
             </w:r>
           </w:p>
         </w:tc>
@@ -5298,7 +5432,7 @@
               <w:rPr>
                 <w:sz w:val="16"/>
               </w:rPr>
-              <w:t>0,156</w:t>
+              <w:t>0,161</w:t>
             </w:r>
           </w:p>
         </w:tc>
@@ -5311,7 +5445,7 @@
               <w:rPr>
                 <w:sz w:val="16"/>
               </w:rPr>
-              <w:t>0,671</w:t>
+              <w:t>0,664</w:t>
             </w:r>
           </w:p>
         </w:tc>
@@ -5324,7 +5458,7 @@
               <w:rPr>
                 <w:sz w:val="16"/>
               </w:rPr>
-              <w:t>0,253</w:t>
+              <w:t>0,259</w:t>
             </w:r>
           </w:p>
         </w:tc>
@@ -5337,7 +5471,7 @@
               <w:rPr>
                 <w:sz w:val="16"/>
               </w:rPr>
-              <w:t>0,404</w:t>
+              <w:t>0,409</w:t>
             </w:r>
           </w:p>
         </w:tc>
@@ -5350,7 +5484,7 @@
               <w:rPr>
                 <w:sz w:val="16"/>
               </w:rPr>
-              <w:t>0,863</w:t>
+              <w:t>0,868</w:t>
             </w:r>
           </w:p>
         </w:tc>
@@ -5361,9 +5495,10 @@
           <w:p>
             <w:r>
               <w:rPr>
-                <w:sz w:val="16"/>
-              </w:rPr>
-              <w:t>0,310</w:t>
+                <w:b/>
+                <w:sz w:val="16"/>
+              </w:rPr>
+              <w:t>0,320</w:t>
             </w:r>
           </w:p>
         </w:tc>
@@ -5376,7 +5511,7 @@
               <w:rPr>
                 <w:sz w:val="16"/>
               </w:rPr>
-              <w:t>leaf=60; maior recall/F2</w:t>
+              <w:t>leaf=60; maior AUC-PR</w:t>
             </w:r>
           </w:p>
         </w:tc>
@@ -5420,7 +5555,7 @@
                 <w:b/>
                 <w:sz w:val="16"/>
               </w:rPr>
-              <w:t>0,245</w:t>
+              <w:t>0,187</w:t>
             </w:r>
           </w:p>
         </w:tc>
@@ -5434,7 +5569,7 @@
                 <w:b/>
                 <w:sz w:val="16"/>
               </w:rPr>
-              <w:t>0,463</w:t>
+              <w:t>0,595</w:t>
             </w:r>
           </w:p>
         </w:tc>
@@ -5448,7 +5583,7 @@
                 <w:b/>
                 <w:sz w:val="16"/>
               </w:rPr>
-              <w:t>0,320</w:t>
+              <w:t>0,284</w:t>
             </w:r>
           </w:p>
         </w:tc>
@@ -5462,7 +5597,7 @@
                 <w:b/>
                 <w:sz w:val="16"/>
               </w:rPr>
-              <w:t>0,393</w:t>
+              <w:t>0,414</w:t>
             </w:r>
           </w:p>
         </w:tc>
@@ -5476,7 +5611,7 @@
                 <w:b/>
                 <w:sz w:val="16"/>
               </w:rPr>
-              <w:t>0,864</w:t>
+              <w:t>0,870</w:t>
             </w:r>
           </w:p>
         </w:tc>
@@ -5487,10 +5622,9 @@
           <w:p>
             <w:r>
               <w:rPr>
-                <w:b/>
-                <w:sz w:val="16"/>
-              </w:rPr>
-              <w:t>0,317</w:t>
+                <w:sz w:val="16"/>
+              </w:rPr>
+              <w:t>0,296</w:t>
             </w:r>
           </w:p>
         </w:tc>
@@ -5503,7 +5637,126 @@
               <w:rPr>
                 <w:sz w:val="16"/>
               </w:rPr>
-              <w:t>limiar F2=0,066</w:t>
+              <w:t>limiar F2=0,062</w:t>
+            </w:r>
+          </w:p>
+        </w:tc>
+      </w:tr>
+      <w:tr>
+        <w:tc>
+          <w:tcPr>
+            <w:tcW w:type="dxa" w:w="1045"/>
+          </w:tcPr>
+          <w:p>
+            <w:r>
+              <w:rPr>
+                <w:sz w:val="16"/>
+              </w:rPr>
+              <w:t>Weibull AFT (risco em 4 h)</w:t>
+            </w:r>
+          </w:p>
+        </w:tc>
+        <w:tc>
+          <w:tcPr>
+            <w:tcW w:type="dxa" w:w="1045"/>
+          </w:tcPr>
+          <w:p>
+            <w:r>
+              <w:rPr>
+                <w:sz w:val="16"/>
+              </w:rPr>
+              <w:t>teste</w:t>
+            </w:r>
+          </w:p>
+        </w:tc>
+        <w:tc>
+          <w:tcPr>
+            <w:tcW w:type="dxa" w:w="1045"/>
+          </w:tcPr>
+          <w:p>
+            <w:r>
+              <w:rPr>
+                <w:sz w:val="16"/>
+              </w:rPr>
+              <w:t>—</w:t>
+            </w:r>
+          </w:p>
+        </w:tc>
+        <w:tc>
+          <w:tcPr>
+            <w:tcW w:type="dxa" w:w="1045"/>
+          </w:tcPr>
+          <w:p>
+            <w:r>
+              <w:rPr>
+                <w:sz w:val="16"/>
+              </w:rPr>
+              <w:t>—</w:t>
+            </w:r>
+          </w:p>
+        </w:tc>
+        <w:tc>
+          <w:tcPr>
+            <w:tcW w:type="dxa" w:w="1045"/>
+          </w:tcPr>
+          <w:p>
+            <w:r>
+              <w:rPr>
+                <w:sz w:val="16"/>
+              </w:rPr>
+              <w:t>—</w:t>
+            </w:r>
+          </w:p>
+        </w:tc>
+        <w:tc>
+          <w:tcPr>
+            <w:tcW w:type="dxa" w:w="1045"/>
+          </w:tcPr>
+          <w:p>
+            <w:r>
+              <w:rPr>
+                <w:sz w:val="16"/>
+              </w:rPr>
+              <w:t>—</w:t>
+            </w:r>
+          </w:p>
+        </w:tc>
+        <w:tc>
+          <w:tcPr>
+            <w:tcW w:type="dxa" w:w="1045"/>
+          </w:tcPr>
+          <w:p>
+            <w:r>
+              <w:rPr>
+                <w:sz w:val="16"/>
+              </w:rPr>
+              <w:t>0,841</w:t>
+            </w:r>
+          </w:p>
+        </w:tc>
+        <w:tc>
+          <w:tcPr>
+            <w:tcW w:type="dxa" w:w="1045"/>
+          </w:tcPr>
+          <w:p>
+            <w:r>
+              <w:rPr>
+                <w:sz w:val="16"/>
+              </w:rPr>
+              <w:t>0,266</w:t>
+            </w:r>
+          </w:p>
+        </w:tc>
+        <w:tc>
+          <w:tcPr>
+            <w:tcW w:type="dxa" w:w="1045"/>
+          </w:tcPr>
+          <w:p>
+            <w:r>
+              <w:rPr>
+                <w:sz w:val="16"/>
+              </w:rPr>
+              <w:t>C-index 0,781</w:t>
             </w:r>
           </w:p>
         </w:tc>
@@ -5634,16 +5887,16 @@
         <w:jc w:val="both"/>
       </w:pPr>
       <w:r>
-        <w:t xml:space="preserve">Na validação os números são consistentes (LightGBM: AUC-PR 0,198; RF 0,189; RL 0,105; Heurística 0,102), sem inversão de ranking entre validação e teste — indício de tuning sem overfitting à validação. O LightGBM domina em AUC-PR e precisão; o </w:t>
+        <w:t xml:space="preserve">A seleção do campeão seguiu o critério pré-registrado — média de AP nas duas janelas de tuning: LightGBM 0,223 &gt; RF 0,216 &gt; RL 0,119 ≈ Heurística 0,102. No teste o resultado é um </w:t>
       </w:r>
       <w:r>
         <w:rPr>
           <w:b/>
         </w:rPr>
-        <w:t>Random Forest é a alternativa recall-orientada</w:t>
-      </w:r>
-      <w:r>
-        <w:t xml:space="preserve"> (67,1% de recall e o maior F2, 0,404, ao custo de 2,4× mais falsos positivos por acerto) — a escolha entre os dois é uma decisão de capacidade da equipe de inspeção, não de estatística. As curvas ROC e PR (Figura 9) mostram que a vantagem do LightGBM se concentra na região de precisão 0,2–0,4.</w:t>
+        <w:t>empate técnico entre os dois modelos de árvore</w:t>
+      </w:r>
+      <w:r>
+        <w:t>: o LightGBM lidera em AUC-ROC (0,870) e F2 (0,414); o Random Forest, em AUC-PR (0,320) — a diferença entre eles é menor que a oscilação quinzenal do próprio teste (seção 4.2), e ambos superam com folga a heurística. Mantém-se o LightGBM como campeão pelo critério definido antes de tocar o teste; trocar de modelo depois de ver o teste seria exatamente o vício metodológico que o desenho evita. O Weibull AFT, com formulação completamente diferente (tempo até o evento, com censura), confirma o mesmo ranking de risco (AUC-ROC 0,841) — três famílias de modelo concordando é evidência de sinal real, não de artefato. As curvas ROC e PR estão na Figura 9.</w:t>
       </w:r>
     </w:p>
     <w:p>
@@ -5706,7 +5959,7 @@
         <w:rPr>
           <w:b/>
         </w:rPr>
-        <w:t>Matriz de confusão (teste, limiar F2 = 0,066):</w:t>
+        <w:t>Matriz de confusão (teste, limiar F2 = 0,062):</w:t>
       </w:r>
     </w:p>
     <w:tbl>
@@ -5780,7 +6033,7 @@
               <w:rPr>
                 <w:sz w:val="16"/>
               </w:rPr>
-              <w:t>VN = 50.335</w:t>
+              <w:t>VN = 48.246</w:t>
             </w:r>
           </w:p>
         </w:tc>
@@ -5793,7 +6046,7 @@
               <w:rPr>
                 <w:sz w:val="16"/>
               </w:rPr>
-              <w:t>FP = 2.566</w:t>
+              <w:t>FP = 4.655</w:t>
             </w:r>
           </w:p>
         </w:tc>
@@ -5822,7 +6075,7 @@
               <w:rPr>
                 <w:sz w:val="16"/>
               </w:rPr>
-              <w:t>FN = 967</w:t>
+              <w:t>FN = 729</w:t>
             </w:r>
           </w:p>
         </w:tc>
@@ -5835,7 +6088,7 @@
               <w:rPr>
                 <w:sz w:val="16"/>
               </w:rPr>
-              <w:t>VP = 832</w:t>
+              <w:t>VP = 1.070</w:t>
             </w:r>
           </w:p>
         </w:tc>
@@ -5847,7 +6100,16 @@
         <w:jc w:val="both"/>
       </w:pPr>
       <w:r>
-        <w:t>Tradução operacional: em junho, o modelo teria emitido 3.398 cartões de inspeção (~113/dia na frota de 47, ~2,4 por equipamento-dia); 832 antecederam alerta real. Os 2.566 falsos positivos custam ~86 verificações/dia distribuídas na frota — uma carga alta, parcialmente absorvível porque a inspeção visual agrega valor mesmo sem falha iminente; a alternativa de operar com precisão ≥30% (limiar 0,070) reduziria o recall para 38,8% e é discutida em 4.6. Os 967 falsos negativos são o custo residual: paradas que continuariam chegando sem aviso.</w:t>
+        <w:t xml:space="preserve">Tradução operacional: no ponto F2, o modelo teria emitido 5.725 cartões de inspeção em junho (~191/dia na frota de 47) — uma carga desenhada para capturar o máximo de alertas (59,5% dos pontos positivos), adequada se a inspeção for barata e distribuída (verificação visual no abastecimento, por exemplo). No </w:t>
+      </w:r>
+      <w:r>
+        <w:rPr>
+          <w:b/>
+        </w:rPr>
+        <w:t>ponto custo-ótimo</w:t>
+      </w:r>
+      <w:r>
+        <w:t xml:space="preserve"> (limiar 0,074), os cartões caem para 1.340/mês (~45/dia, ~1 por equipamento-dia), com precisão de 41,9% — quase um acerto a cada dois cartões. A escolha entre os dois pontos é uma decisão de capacidade da equipe, e a seção 4.6 quantifica o valor de cada um. Os falsos negativos (729 no ponto F2) são o custo residual: paradas que continuariam chegando sem aviso.</w:t>
       </w:r>
     </w:p>
     <w:p>
@@ -5858,7 +6120,7 @@
         <w:rPr>
           <w:b/>
         </w:rPr>
-        <w:t>Casos extremos — onde o modelo sistematicamente falha (Figura 10 e tabelas de FN):</w:t>
+        <w:t>Casos extremos — onde o modelo sistematicamente falha (Figura 10 e tabelas de FN, no limiar F2):</w:t>
       </w:r>
     </w:p>
     <w:p>
@@ -5906,7 +6168,7 @@
         <w:t>Right Front Brake Temperature - Active</w:t>
       </w:r>
       <w:r>
-        <w:t xml:space="preserve"> tem apenas 12,9% de FN (480 positivos — o modelo domina o padrão), enquanto as temperaturas de freio </w:t>
+        <w:t xml:space="preserve"> tem apenas 5,8% de FN (480 positivos — o modelo domina o padrão), enquanto as temperaturas de freio </w:t>
       </w:r>
       <w:r>
         <w:rPr>
@@ -5915,7 +6177,7 @@
         <w:t>traseiras</w:t>
       </w:r>
       <w:r>
-        <w:t xml:space="preserve"> têm ~80% de FN (168 positivos). O precursor existe no eixo dianteiro e é mais fraco no traseiro — pista concreta para investigação de instrumentação.</w:t>
+        <w:t xml:space="preserve"> têm ~67% de FN (168 positivos). O precursor existe no eixo dianteiro e é fraco no traseiro — pista concreta para investigação de instrumentação.</w:t>
       </w:r>
     </w:p>
     <w:p>
@@ -5926,7 +6188,7 @@
         <w:rPr>
           <w:b/>
         </w:rPr>
-        <w:t>`Aftercooler Level - Active`: 87,6% de FN</w:t>
+        <w:t>`Aftercooler Level - Active`: 74,4% de FN</w:t>
       </w:r>
       <w:r>
         <w:t xml:space="preserve"> (121 positivos) e </w:t>
@@ -5935,10 +6197,20 @@
         <w:rPr>
           <w:b/>
         </w:rPr>
-        <w:t>`Transmission Oil Level - Active`: 64,8%</w:t>
-      </w:r>
-      <w:r>
-        <w:t xml:space="preserve"> (586 positivos — o evento mais frequente do teste): perdas de nível podem ser abruptas (vazamento), sem rampa de eventos anterior.</w:t>
+        <w:t>`Engine Coolant Flow - Active`: 78,3%</w:t>
+      </w:r>
+      <w:r>
+        <w:t xml:space="preserve"> (46): perdas de nível e fluxo podem ser abruptas (vazamento), sem rampa de eventos anterior. Já </w:t>
+      </w:r>
+      <w:r>
+        <w:rPr>
+          <w:rFonts w:ascii="Consolas" w:hAnsi="Consolas"/>
+          <w:sz w:val="18"/>
+        </w:rPr>
+        <w:t>Transmission Oil Level - Active</w:t>
+      </w:r>
+      <w:r>
+        <w:t>, o evento mais frequente do teste (586 positivos), tem 46,8% de FN — o modelo captura a maioria.</w:t>
       </w:r>
     </w:p>
     <w:p>
@@ -5946,7 +6218,7 @@
         <w:pStyle w:val="ListBullet"/>
       </w:pPr>
       <w:r>
-        <w:t>A frota 793-D 4S tem 33% de FN contra 69% da 5S — a 4S dispara mais "escada" de eventos nível 2 antes do alerta.</w:t>
+        <w:t>A frota 793-D 4S tem 26% de FN contra 50% da 5S — a 4S dispara mais "escada" de eventos nível 2 antes do alerta.</w:t>
       </w:r>
     </w:p>
     <w:p>
@@ -5960,16 +6232,16 @@
         <w:t>Degradação temporal (drift).</w:t>
       </w:r>
       <w:r>
-        <w:t xml:space="preserve"> AUC-ROC por quinzena: mai 0,866 → 0,765; jun 0,860 → 0,868. AUC-PR: mai 0,283 → </w:t>
+        <w:t xml:space="preserve"> AUC-ROC por quinzena: mai 0,866 → 0,758; jun 0,863 → 0,876. AUC-PR: mai 0,293 → </w:t>
       </w:r>
       <w:r>
         <w:rPr>
           <w:b/>
         </w:rPr>
-        <w:t>0,091</w:t>
-      </w:r>
-      <w:r>
-        <w:t xml:space="preserve">; jun 0,278 → 0,350. A queda abrupta na 2ª quinzena de maio acompanha a queda de prevalência (3,85% → 2,51%) e explica por que o early stopping selecionou um modelo compacto (seção 3.5); em junho o desempenho se recupera e se mantém estável. Não há tendência monotônica de queda — o padrão é de </w:t>
+        <w:t>0,089</w:t>
+      </w:r>
+      <w:r>
+        <w:t xml:space="preserve">; jun 0,245 → 0,337. A queda abrupta na 2ª quinzena de maio acompanha a queda de prevalência (3,85% → 2,51%) — foi exatamente esse comportamento que motivou o tuning em duas janelas (seção 3.4); em junho o desempenho se recupera e cresce ao longo do mês. Não há tendência monotônica de queda — o padrão é de </w:t>
       </w:r>
       <w:r>
         <w:rPr>
@@ -6066,7 +6338,7 @@
         <w:t>`h_desde_crit1`</w:t>
       </w:r>
       <w:r>
-        <w:t xml:space="preserve"> (0,019) — proximidade do último evento crítico, o degrau final da escada de severidade.</w:t>
+        <w:t xml:space="preserve"> (0,020) — proximidade do último evento crítico, o degrau final da escada de severidade.</w:t>
       </w:r>
     </w:p>
     <w:p>
@@ -6080,7 +6352,7 @@
         <w:t>`n_dg_4h`</w:t>
       </w:r>
       <w:r>
-        <w:t xml:space="preserve"> (0,017) e </w:t>
+        <w:t xml:space="preserve"> (0,019) e </w:t>
       </w:r>
       <w:r>
         <w:rPr>
@@ -6089,7 +6361,7 @@
         <w:t>`n_dg_12h`</w:t>
       </w:r>
       <w:r>
-        <w:t xml:space="preserve"> (0,012) — rajada de alarmes do catálogo em janela curta: a matéria-prima das regras.</w:t>
+        <w:t xml:space="preserve"> (0,013) — rajada de alarmes do catálogo em janela curta: a matéria-prima das regras.</w:t>
       </w:r>
     </w:p>
     <w:p>
@@ -6103,7 +6375,7 @@
         <w:t>`tag_taxa_alerta`</w:t>
       </w:r>
       <w:r>
-        <w:t xml:space="preserve"> (0,014) e </w:t>
+        <w:t xml:space="preserve"> (0,013) e </w:t>
       </w:r>
       <w:r>
         <w:rPr>
@@ -6112,7 +6384,7 @@
         <w:t>`op_taxa_alerta`</w:t>
       </w:r>
       <w:r>
-        <w:t xml:space="preserve"> (0,010) — o "quem": equipamento cronicamente ofensor e operador com histórico elevado (H2 e H3 confirmadas dentro do modelo).</w:t>
+        <w:t xml:space="preserve"> (0,008) — o "quem": equipamento cronicamente ofensor e operador com histórico elevado (H2 e H3 confirmadas dentro do modelo).</w:t>
       </w:r>
     </w:p>
     <w:p>
@@ -6120,25 +6392,34 @@
         <w:jc w:val="both"/>
       </w:pPr>
       <w:r>
-        <w:t xml:space="preserve">Nenhuma feature importante carece de explicação operacional — critério de validação de sentido atendido. O waterfall (Figura 12) decompõe a predição de maior score entre os verdadeiros positivos (CA65926 — justamente o equipamento mais ofensor do semestre —, 12/06/2025 20:53): </w:t>
+        <w:t xml:space="preserve">Nenhuma feature importante carece de explicação operacional — critério de validação de sentido atendido. O waterfall (Figura 12) decompõe a predição de maior score entre os verdadeiros positivos (CA65926 — justamente o equipamento mais ofensor do semestre —, 28/06/2025 03:00): </w:t>
       </w:r>
       <w:r>
         <w:rPr>
           <w:b/>
         </w:rPr>
-        <w:t>13 alarmes do catálogo nas últimas 4 h</w:t>
-      </w:r>
-      <w:r>
-        <w:t xml:space="preserve"> (18 em 12 h), </w:t>
+        <w:t>77 alarmes do catálogo nas últimas 4 h</w:t>
+      </w:r>
+      <w:r>
+        <w:t xml:space="preserve"> (236 em 12 h), </w:t>
       </w:r>
       <w:r>
         <w:rPr>
           <w:b/>
         </w:rPr>
-        <w:t>alerta anterior há apenas 4,2 h</w:t>
-      </w:r>
-      <w:r>
-        <w:t>, 120 eventos críticos em 72 h e 19 quase-gatilhos em 24 h somam +0,39 em log-odds sobre a base E[f(X)] = −2,75, levando o equipamento ao topo do ranking do dia; ele disparou novo alerta dentro da janela de 4 h. É o caso de uso do painel: o cartão de inspeção viria com essas três evidências listadas.</w:t>
+        <w:t>alerta anterior há 3,4 h</w:t>
+      </w:r>
+      <w:r>
+        <w:t xml:space="preserve"> e </w:t>
+      </w:r>
+      <w:r>
+        <w:rPr>
+          <w:b/>
+        </w:rPr>
+        <w:t>evento crítico há ~1 minuto</w:t>
+      </w:r>
+      <w:r>
+        <w:t xml:space="preserve"> somam +0,38 em log-odds sobre a base E[f(X)] = −2,75, levando o equipamento ao topo do ranking do dia; ele disparou novo alerta dentro da janela de 4 h. É o caso de uso do painel: o cartão de inspeção viria com essas três evidências listadas.</w:t>
       </w:r>
     </w:p>
     <w:p>
@@ -6187,7 +6468,7 @@
       <w:r>
         <w:drawing>
           <wp:inline xmlns:a="http://schemas.openxmlformats.org/drawingml/2006/main" xmlns:pic="http://schemas.openxmlformats.org/drawingml/2006/picture">
-            <wp:extent cx="5760000" cy="5284752"/>
+            <wp:extent cx="5760000" cy="5203184"/>
             <wp:docPr id="12" name="Picture 12"/>
             <wp:cNvGraphicFramePr>
               <a:graphicFrameLocks noChangeAspect="1"/>
@@ -6208,7 +6489,7 @@
                   <pic:spPr>
                     <a:xfrm>
                       <a:off x="0" y="0"/>
-                      <a:ext cx="5760000" cy="5284752"/>
+                      <a:ext cx="5760000" cy="5203184"/>
                     </a:xfrm>
                     <a:prstGeom prst="rect"/>
                   </pic:spPr>
@@ -6229,7 +6510,374 @@
           <w:color w:val="0B6E5D"/>
           <w:sz w:val="25"/>
         </w:rPr>
-        <w:t>4.4 Abordagem não supervisionada — o que ela adiciona</w:t>
+        <w:t>4.4 Abordagens complementares — sobrevivência e não supervisionada</w:t>
+      </w:r>
+    </w:p>
+    <w:p>
+      <w:pPr>
+        <w:jc w:val="both"/>
+      </w:pPr>
+      <w:r>
+        <w:t xml:space="preserve">O </w:t>
+      </w:r>
+      <w:r>
+        <w:rPr>
+          <w:b/>
+        </w:rPr>
+        <w:t>Weibull AFT</w:t>
+      </w:r>
+      <w:r>
+        <w:t xml:space="preserve"> responde uma pergunta que o classificador não alcança: </w:t>
+      </w:r>
+      <w:r>
+        <w:rPr>
+          <w:i/>
+        </w:rPr>
+        <w:t>quanto tempo</w:t>
+      </w:r>
+      <w:r>
+        <w:t xml:space="preserve"> até o próximo alerta. Com C-index de 0,781 no teste, o ranqueamento de tempos é sólido, e os </w:t>
+      </w:r>
+      <w:r>
+        <w:rPr>
+          <w:b/>
+        </w:rPr>
+        <w:t>fatores de aceleração</w:t>
+      </w:r>
+      <w:r>
+        <w:t xml:space="preserve"> (razão de tempo por +1 desvio-padrão, todos com p &lt; 0,05) contam a mesma história física do SHAP por outro caminho:</w:t>
+      </w:r>
+    </w:p>
+    <w:tbl>
+      <w:tblPr>
+        <w:tblStyle w:val="LightGrid-Accent3"/>
+        <w:tblW w:type="auto" w:w="0"/>
+        <w:tblLook w:firstColumn="1" w:firstRow="1" w:lastColumn="0" w:lastRow="0" w:noHBand="0" w:noVBand="1" w:val="04A0"/>
+      </w:tblPr>
+      <w:tblGrid>
+        <w:gridCol w:w="3135"/>
+        <w:gridCol w:w="3135"/>
+        <w:gridCol w:w="3135"/>
+      </w:tblGrid>
+      <w:tr>
+        <w:tc>
+          <w:tcPr>
+            <w:tcW w:type="dxa" w:w="3135"/>
+          </w:tcPr>
+          <w:p>
+            <w:r>
+              <w:rPr>
+                <w:b/>
+                <w:sz w:val="16"/>
+              </w:rPr>
+              <w:t>Feature</w:t>
+            </w:r>
+          </w:p>
+        </w:tc>
+        <w:tc>
+          <w:tcPr>
+            <w:tcW w:type="dxa" w:w="3135"/>
+          </w:tcPr>
+          <w:p>
+            <w:r>
+              <w:rPr>
+                <w:b/>
+                <w:sz w:val="16"/>
+              </w:rPr>
+              <w:t>Razão de tempo (por +1 dp)</w:t>
+            </w:r>
+          </w:p>
+        </w:tc>
+        <w:tc>
+          <w:tcPr>
+            <w:tcW w:type="dxa" w:w="3135"/>
+          </w:tcPr>
+          <w:p>
+            <w:r>
+              <w:rPr>
+                <w:b/>
+                <w:sz w:val="16"/>
+              </w:rPr>
+              <w:t>Leitura</w:t>
+            </w:r>
+          </w:p>
+        </w:tc>
+      </w:tr>
+      <w:tr>
+        <w:tc>
+          <w:tcPr>
+            <w:tcW w:type="dxa" w:w="3135"/>
+          </w:tcPr>
+          <w:p>
+            <w:r>
+              <w:rPr>
+                <w:rFonts w:ascii="Consolas" w:hAnsi="Consolas"/>
+                <w:sz w:val="16"/>
+              </w:rPr>
+              <w:t>tag_taxa_alerta</w:t>
+            </w:r>
+          </w:p>
+        </w:tc>
+        <w:tc>
+          <w:tcPr>
+            <w:tcW w:type="dxa" w:w="3135"/>
+          </w:tcPr>
+          <w:p>
+            <w:r>
+              <w:rPr>
+                <w:b/>
+                <w:sz w:val="16"/>
+              </w:rPr>
+              <w:t>0,60</w:t>
+            </w:r>
+          </w:p>
+        </w:tc>
+        <w:tc>
+          <w:tcPr>
+            <w:tcW w:type="dxa" w:w="3135"/>
+          </w:tcPr>
+          <w:p>
+            <w:r>
+              <w:rPr>
+                <w:sz w:val="16"/>
+              </w:rPr>
+              <w:t>equipamento cronicamente ofensor encurta o tempo até o alerta em 40%</w:t>
+            </w:r>
+          </w:p>
+        </w:tc>
+      </w:tr>
+      <w:tr>
+        <w:tc>
+          <w:tcPr>
+            <w:tcW w:type="dxa" w:w="3135"/>
+          </w:tcPr>
+          <w:p>
+            <w:r>
+              <w:rPr>
+                <w:rFonts w:ascii="Consolas" w:hAnsi="Consolas"/>
+                <w:sz w:val="16"/>
+              </w:rPr>
+              <w:t>horas_operadas_24h</w:t>
+            </w:r>
+          </w:p>
+        </w:tc>
+        <w:tc>
+          <w:tcPr>
+            <w:tcW w:type="dxa" w:w="3135"/>
+          </w:tcPr>
+          <w:p>
+            <w:r>
+              <w:rPr>
+                <w:sz w:val="16"/>
+              </w:rPr>
+              <w:t>0,79</w:t>
+            </w:r>
+          </w:p>
+        </w:tc>
+        <w:tc>
+          <w:tcPr>
+            <w:tcW w:type="dxa" w:w="3135"/>
+          </w:tcPr>
+          <w:p>
+            <w:r>
+              <w:rPr>
+                <w:sz w:val="16"/>
+              </w:rPr>
+              <w:t>uso intenso acelera a falha (exposição)</w:t>
+            </w:r>
+          </w:p>
+        </w:tc>
+      </w:tr>
+      <w:tr>
+        <w:tc>
+          <w:tcPr>
+            <w:tcW w:type="dxa" w:w="3135"/>
+          </w:tcPr>
+          <w:p>
+            <w:r>
+              <w:rPr>
+                <w:rFonts w:ascii="Consolas" w:hAnsi="Consolas"/>
+                <w:sz w:val="16"/>
+              </w:rPr>
+              <w:t>op_taxa_alerta</w:t>
+            </w:r>
+          </w:p>
+        </w:tc>
+        <w:tc>
+          <w:tcPr>
+            <w:tcW w:type="dxa" w:w="3135"/>
+          </w:tcPr>
+          <w:p>
+            <w:r>
+              <w:rPr>
+                <w:sz w:val="16"/>
+              </w:rPr>
+              <w:t>0,82</w:t>
+            </w:r>
+          </w:p>
+        </w:tc>
+        <w:tc>
+          <w:tcPr>
+            <w:tcW w:type="dxa" w:w="3135"/>
+          </w:tcPr>
+          <w:p>
+            <w:r>
+              <w:rPr>
+                <w:sz w:val="16"/>
+              </w:rPr>
+              <w:t>o operador acelera ou adia o alerta</w:t>
+            </w:r>
+          </w:p>
+        </w:tc>
+      </w:tr>
+      <w:tr>
+        <w:tc>
+          <w:tcPr>
+            <w:tcW w:type="dxa" w:w="3135"/>
+          </w:tcPr>
+          <w:p>
+            <w:r>
+              <w:rPr>
+                <w:rFonts w:ascii="Consolas" w:hAnsi="Consolas"/>
+                <w:sz w:val="16"/>
+              </w:rPr>
+              <w:t>n_dg_24h</w:t>
+            </w:r>
+          </w:p>
+        </w:tc>
+        <w:tc>
+          <w:tcPr>
+            <w:tcW w:type="dxa" w:w="3135"/>
+          </w:tcPr>
+          <w:p>
+            <w:r>
+              <w:rPr>
+                <w:sz w:val="16"/>
+              </w:rPr>
+              <w:t>0,85</w:t>
+            </w:r>
+          </w:p>
+        </w:tc>
+        <w:tc>
+          <w:tcPr>
+            <w:tcW w:type="dxa" w:w="3135"/>
+          </w:tcPr>
+          <w:p>
+            <w:r>
+              <w:rPr>
+                <w:sz w:val="16"/>
+              </w:rPr>
+              <w:t>rajada de alarmes do catálogo encurta o relógio</w:t>
+            </w:r>
+          </w:p>
+        </w:tc>
+      </w:tr>
+      <w:tr>
+        <w:tc>
+          <w:tcPr>
+            <w:tcW w:type="dxa" w:w="3135"/>
+          </w:tcPr>
+          <w:p>
+            <w:r>
+              <w:rPr>
+                <w:rFonts w:ascii="Consolas" w:hAnsi="Consolas"/>
+                <w:sz w:val="16"/>
+              </w:rPr>
+              <w:t>h_desde_alerta_dg</w:t>
+            </w:r>
+          </w:p>
+        </w:tc>
+        <w:tc>
+          <w:tcPr>
+            <w:tcW w:type="dxa" w:w="3135"/>
+          </w:tcPr>
+          <w:p>
+            <w:r>
+              <w:rPr>
+                <w:b/>
+                <w:sz w:val="16"/>
+              </w:rPr>
+              <w:t>1,86</w:t>
+            </w:r>
+          </w:p>
+        </w:tc>
+        <w:tc>
+          <w:tcPr>
+            <w:tcW w:type="dxa" w:w="3135"/>
+          </w:tcPr>
+          <w:p>
+            <w:r>
+              <w:rPr>
+                <w:sz w:val="16"/>
+              </w:rPr>
+              <w:t>quanto mais longe do último alerta, mais longo o tempo até o próximo (recorrência)</w:t>
+            </w:r>
+          </w:p>
+        </w:tc>
+      </w:tr>
+      <w:tr>
+        <w:tc>
+          <w:tcPr>
+            <w:tcW w:type="dxa" w:w="3135"/>
+          </w:tcPr>
+          <w:p>
+            <w:r>
+              <w:rPr>
+                <w:rFonts w:ascii="Consolas" w:hAnsi="Consolas"/>
+                <w:sz w:val="16"/>
+              </w:rPr>
+              <w:t>h_desde_manutencao</w:t>
+            </w:r>
+          </w:p>
+        </w:tc>
+        <w:tc>
+          <w:tcPr>
+            <w:tcW w:type="dxa" w:w="3135"/>
+          </w:tcPr>
+          <w:p>
+            <w:r>
+              <w:rPr>
+                <w:sz w:val="16"/>
+              </w:rPr>
+              <w:t>1,67</w:t>
+            </w:r>
+          </w:p>
+        </w:tc>
+        <w:tc>
+          <w:tcPr>
+            <w:tcW w:type="dxa" w:w="3135"/>
+          </w:tcPr>
+          <w:p>
+            <w:r>
+              <w:rPr>
+                <w:sz w:val="16"/>
+              </w:rPr>
+              <w:t xml:space="preserve">máquina há muito sem intervenção </w:t>
+            </w:r>
+            <w:r>
+              <w:rPr>
+                <w:i/>
+                <w:sz w:val="16"/>
+              </w:rPr>
+              <w:t>e ainda sem alarmes</w:t>
+            </w:r>
+            <w:r>
+              <w:rPr>
+                <w:sz w:val="16"/>
+              </w:rPr>
+              <w:t xml:space="preserve"> tende a seguir saudável</w:t>
+            </w:r>
+          </w:p>
+        </w:tc>
+      </w:tr>
+    </w:tbl>
+    <w:p/>
+    <w:p>
+      <w:pPr>
+        <w:jc w:val="both"/>
+      </w:pPr>
+      <w:r>
+        <w:t>Convergência entre formulações independentes — classificação (SHAP) e sobrevivência (AFT) — é o teste de robustez mais forte deste trabalho: o sinal de recorrência, rajada e "quem" (equipamento/operador) domina nos dois. Como risco em 4 h (1 − S(4|x)), o AFT alcança AUC-ROC 0,841/AUC-PR 0,266 — abaixo dos modelos de árvore (que capturam interações não lineares), mas acima da Regressão Logística e da heurística, entregando de brinde a estimativa de tempo que a manutenção usa para sequenciar a fila.</w:t>
       </w:r>
     </w:p>
     <w:p>
@@ -6874,7 +7522,7 @@
         <w:jc w:val="both"/>
       </w:pPr>
       <w:r>
-        <w:t>O score ordena a fila de manutenção: no último dia do teste (30/06), os cinco primeiros da fila (CA65927, CA65909, CA65926, CA65924, CA65935) concentravam os maiores riscos residuais da frota — quatro deles estão entre os dez maiores ofensores do semestre. Ao longo de junho, seguir a fila do modelo teria colocado a equipe de inspeção na máquina certa antes do alerta em 6 de cada 10 disparos (taxa de antecipação de 60,7%).</w:t>
+        <w:t>O score ordena a fila de manutenção: no último dia do teste (30/06), os cinco primeiros da fila (CA65926, CA65927, CA65909, CA65924, CA65935) concentravam os maiores riscos residuais da frota — quatro deles estão entre os dez maiores ofensores do semestre. Ao longo de junho, seguir a fila do modelo no ponto de captura teria colocado a equipe de inspeção na máquina certa antes do alerta em quase 7 de cada 10 disparos (taxa de antecipação de 68,6%).</w:t>
       </w:r>
     </w:p>
     <w:p>
@@ -6901,25 +7549,34 @@
         <w:t>Comparação com baseline.</w:t>
       </w:r>
       <w:r>
-        <w:t xml:space="preserve"> O LightGBM supera a heurística do despacho em </w:t>
+        <w:t xml:space="preserve"> No ranking, os modelos de árvore superam a heurística do despacho em </w:t>
       </w:r>
       <w:r>
         <w:rPr>
           <w:b/>
         </w:rPr>
-        <w:t>+30% de AUC-PR</w:t>
-      </w:r>
-      <w:r>
-        <w:t xml:space="preserve"> (0,317 vs 0,245) e </w:t>
+        <w:t>+31% de AUC-PR</w:t>
+      </w:r>
+      <w:r>
+        <w:t xml:space="preserve"> (RF 0,320 vs 0,245) e </w:t>
       </w:r>
       <w:r>
         <w:rPr>
           <w:b/>
         </w:rPr>
-        <w:t>+67% de precisão</w:t>
-      </w:r>
-      <w:r>
-        <w:t xml:space="preserve"> (0,245 vs 0,147) no ponto operacional; sobre o Dummy, o lift de precisão é 7,4×. Em termos práticos: para cada 100 cartões de inspeção, a heurística acerta 15 e o modelo 25 — com a heurística capturando mais alertas (59% vs 46%) ao custo de quase o dobro de inspeções vazias por acerto. O Random Forest oferece o meio-termo (recall 67%, precisão 16%).</w:t>
+        <w:t>+16 pontos de AUC-ROC</w:t>
+      </w:r>
+      <w:r>
+        <w:t xml:space="preserve"> (LightGBM 0,870 vs 0,750); sobre o Dummy, o lift de AUC-PR é 9×. No ponto de operação custo-ótimo, o contraste é direto: para cada 100 cartões de inspeção, a heurística acerta 15 e o modelo </w:t>
+      </w:r>
+      <w:r>
+        <w:rPr>
+          <w:b/>
+        </w:rPr>
+        <w:t>42</w:t>
+      </w:r>
+      <w:r>
+        <w:t xml:space="preserve"> — quase o triplo de aproveitamento da equipe.</w:t>
       </w:r>
     </w:p>
     <w:p>
@@ -6930,7 +7587,19 @@
         <w:rPr>
           <w:b/>
         </w:rPr>
-        <w:t>Tradução para impacto (jun/2025, premissas explícitas: custo de indisponibilidade R$ 6.000/h, inspeção R$ 450, 35% da duração da corretiva economizável quando a intervenção é antecipada; duração média do episódio de manutenção reconstruído por encadeamento de ciclos: 6,72 h):</w:t>
+        <w:t>Dois pontos de operação, ambos escolhidos na validação e congelados antes do teste.</w:t>
+      </w:r>
+      <w:r>
+        <w:t xml:space="preserve"> O limiar F2 maximiza captura sob custo assimétrico genérico; o limiar </w:t>
+      </w:r>
+      <w:r>
+        <w:rPr>
+          <w:b/>
+        </w:rPr>
+        <w:t>custo-ótimo</w:t>
+      </w:r>
+      <w:r>
+        <w:t xml:space="preserve"> maximiza o benefício líquido estimado usando as premissas financeiras explícitas (custo de indisponibilidade R$ 6.000/h, inspeção R$ 450, 35% da duração da corretiva economizável, episódio médio de manutenção de 6,72 h reconstruído por encadeamento de ciclos):</w:t>
       </w:r>
     </w:p>
     <w:tbl>
@@ -6940,13 +7609,14 @@
         <w:tblLook w:firstColumn="1" w:firstRow="1" w:lastColumn="0" w:lastRow="0" w:noHBand="0" w:noVBand="1" w:val="04A0"/>
       </w:tblPr>
       <w:tblGrid>
-        <w:gridCol w:w="4703"/>
-        <w:gridCol w:w="4703"/>
+        <w:gridCol w:w="3135"/>
+        <w:gridCol w:w="3135"/>
+        <w:gridCol w:w="3135"/>
       </w:tblGrid>
       <w:tr>
         <w:tc>
           <w:tcPr>
-            <w:tcW w:type="dxa" w:w="4703"/>
+            <w:tcW w:type="dxa" w:w="3135"/>
           </w:tcPr>
           <w:p>
             <w:r>
@@ -6954,13 +7624,13 @@
                 <w:b/>
                 <w:sz w:val="16"/>
               </w:rPr>
-              <w:t>Indicador</w:t>
-            </w:r>
-          </w:p>
-        </w:tc>
-        <w:tc>
-          <w:tcPr>
-            <w:tcW w:type="dxa" w:w="4703"/>
+              <w:t>Indicador (teste, jun/2025)</w:t>
+            </w:r>
+          </w:p>
+        </w:tc>
+        <w:tc>
+          <w:tcPr>
+            <w:tcW w:type="dxa" w:w="3135"/>
           </w:tcPr>
           <w:p>
             <w:r>
@@ -6968,7 +7638,21 @@
                 <w:b/>
                 <w:sz w:val="16"/>
               </w:rPr>
-              <w:t>Valor</w:t>
+              <w:t>Ponto F2 (captura)</w:t>
+            </w:r>
+          </w:p>
+        </w:tc>
+        <w:tc>
+          <w:tcPr>
+            <w:tcW w:type="dxa" w:w="3135"/>
+          </w:tcPr>
+          <w:p>
+            <w:r>
+              <w:rPr>
+                <w:b/>
+                <w:sz w:val="16"/>
+              </w:rPr>
+              <w:t>Ponto custo-ótimo (R$)</w:t>
             </w:r>
           </w:p>
         </w:tc>
@@ -6976,27 +7660,40 @@
       <w:tr>
         <w:tc>
           <w:tcPr>
-            <w:tcW w:type="dxa" w:w="4703"/>
-          </w:tcPr>
-          <w:p>
-            <w:r>
-              <w:rPr>
-                <w:sz w:val="16"/>
-              </w:rPr>
-              <w:t>Alertas don't go no mês</w:t>
-            </w:r>
-          </w:p>
-        </w:tc>
-        <w:tc>
-          <w:tcPr>
-            <w:tcW w:type="dxa" w:w="4703"/>
-          </w:tcPr>
-          <w:p>
-            <w:r>
-              <w:rPr>
-                <w:sz w:val="16"/>
-              </w:rPr>
-              <w:t>229</w:t>
+            <w:tcW w:type="dxa" w:w="3135"/>
+          </w:tcPr>
+          <w:p>
+            <w:r>
+              <w:rPr>
+                <w:sz w:val="16"/>
+              </w:rPr>
+              <w:t>Limiar</w:t>
+            </w:r>
+          </w:p>
+        </w:tc>
+        <w:tc>
+          <w:tcPr>
+            <w:tcW w:type="dxa" w:w="3135"/>
+          </w:tcPr>
+          <w:p>
+            <w:r>
+              <w:rPr>
+                <w:sz w:val="16"/>
+              </w:rPr>
+              <w:t>0,062</w:t>
+            </w:r>
+          </w:p>
+        </w:tc>
+        <w:tc>
+          <w:tcPr>
+            <w:tcW w:type="dxa" w:w="3135"/>
+          </w:tcPr>
+          <w:p>
+            <w:r>
+              <w:rPr>
+                <w:sz w:val="16"/>
+              </w:rPr>
+              <w:t>0,074</w:t>
             </w:r>
           </w:p>
         </w:tc>
@@ -7004,40 +7701,40 @@
       <w:tr>
         <w:tc>
           <w:tcPr>
-            <w:tcW w:type="dxa" w:w="4703"/>
-          </w:tcPr>
-          <w:p>
-            <w:r>
-              <w:rPr>
-                <w:sz w:val="16"/>
-              </w:rPr>
-              <w:t>Alertas antecipados (≥1 predição correta nas 4 h anteriores)</w:t>
-            </w:r>
-          </w:p>
-        </w:tc>
-        <w:tc>
-          <w:tcPr>
-            <w:tcW w:type="dxa" w:w="4703"/>
-          </w:tcPr>
-          <w:p>
-            <w:r>
-              <w:rPr>
-                <w:sz w:val="16"/>
-              </w:rPr>
-              <w:t>139 (</w:t>
-            </w:r>
-            <w:r>
-              <w:rPr>
-                <w:b/>
-                <w:sz w:val="16"/>
-              </w:rPr>
-              <w:t>60,7%</w:t>
-            </w:r>
-            <w:r>
-              <w:rPr>
-                <w:sz w:val="16"/>
-              </w:rPr>
-              <w:t>)</w:t>
+            <w:tcW w:type="dxa" w:w="3135"/>
+          </w:tcPr>
+          <w:p>
+            <w:r>
+              <w:rPr>
+                <w:sz w:val="16"/>
+              </w:rPr>
+              <w:t>Precisão / Recall</w:t>
+            </w:r>
+          </w:p>
+        </w:tc>
+        <w:tc>
+          <w:tcPr>
+            <w:tcW w:type="dxa" w:w="3135"/>
+          </w:tcPr>
+          <w:p>
+            <w:r>
+              <w:rPr>
+                <w:sz w:val="16"/>
+              </w:rPr>
+              <w:t>18,7% / 59,5%</w:t>
+            </w:r>
+          </w:p>
+        </w:tc>
+        <w:tc>
+          <w:tcPr>
+            <w:tcW w:type="dxa" w:w="3135"/>
+          </w:tcPr>
+          <w:p>
+            <w:r>
+              <w:rPr>
+                <w:sz w:val="16"/>
+              </w:rPr>
+              <w:t>41,9% / 31,2%</w:t>
             </w:r>
           </w:p>
         </w:tc>
@@ -7045,27 +7742,53 @@
       <w:tr>
         <w:tc>
           <w:tcPr>
-            <w:tcW w:type="dxa" w:w="4703"/>
-          </w:tcPr>
-          <w:p>
-            <w:r>
-              <w:rPr>
-                <w:sz w:val="16"/>
-              </w:rPr>
-              <w:t>Antecedência mediana do primeiro aviso</w:t>
-            </w:r>
-          </w:p>
-        </w:tc>
-        <w:tc>
-          <w:tcPr>
-            <w:tcW w:type="dxa" w:w="4703"/>
-          </w:tcPr>
-          <w:p>
-            <w:r>
-              <w:rPr>
-                <w:sz w:val="16"/>
-              </w:rPr>
-              <w:t>3,2 h</w:t>
+            <w:tcW w:type="dxa" w:w="3135"/>
+          </w:tcPr>
+          <w:p>
+            <w:r>
+              <w:rPr>
+                <w:sz w:val="16"/>
+              </w:rPr>
+              <w:t>Alertas antecipados (de 229)</w:t>
+            </w:r>
+          </w:p>
+        </w:tc>
+        <w:tc>
+          <w:tcPr>
+            <w:tcW w:type="dxa" w:w="3135"/>
+          </w:tcPr>
+          <w:p>
+            <w:r>
+              <w:rPr>
+                <w:sz w:val="16"/>
+              </w:rPr>
+              <w:t>157 (</w:t>
+            </w:r>
+            <w:r>
+              <w:rPr>
+                <w:b/>
+                <w:sz w:val="16"/>
+              </w:rPr>
+              <w:t>68,6%</w:t>
+            </w:r>
+            <w:r>
+              <w:rPr>
+                <w:sz w:val="16"/>
+              </w:rPr>
+              <w:t>)</w:t>
+            </w:r>
+          </w:p>
+        </w:tc>
+        <w:tc>
+          <w:tcPr>
+            <w:tcW w:type="dxa" w:w="3135"/>
+          </w:tcPr>
+          <w:p>
+            <w:r>
+              <w:rPr>
+                <w:sz w:val="16"/>
+              </w:rPr>
+              <w:t>103 (45,0%)</w:t>
             </w:r>
           </w:p>
         </w:tc>
@@ -7073,27 +7796,40 @@
       <w:tr>
         <w:tc>
           <w:tcPr>
-            <w:tcW w:type="dxa" w:w="4703"/>
-          </w:tcPr>
-          <w:p>
-            <w:r>
-              <w:rPr>
-                <w:sz w:val="16"/>
-              </w:rPr>
-              <w:t>Duração média do episódio de manutenção</w:t>
-            </w:r>
-          </w:p>
-        </w:tc>
-        <w:tc>
-          <w:tcPr>
-            <w:tcW w:type="dxa" w:w="4703"/>
-          </w:tcPr>
-          <w:p>
-            <w:r>
-              <w:rPr>
-                <w:sz w:val="16"/>
-              </w:rPr>
-              <w:t>6,72 h</w:t>
+            <w:tcW w:type="dxa" w:w="3135"/>
+          </w:tcPr>
+          <w:p>
+            <w:r>
+              <w:rPr>
+                <w:sz w:val="16"/>
+              </w:rPr>
+              <w:t>Antecedência mediana do 1º aviso</w:t>
+            </w:r>
+          </w:p>
+        </w:tc>
+        <w:tc>
+          <w:tcPr>
+            <w:tcW w:type="dxa" w:w="3135"/>
+          </w:tcPr>
+          <w:p>
+            <w:r>
+              <w:rPr>
+                <w:sz w:val="16"/>
+              </w:rPr>
+              <w:t>3,4 h</w:t>
+            </w:r>
+          </w:p>
+        </w:tc>
+        <w:tc>
+          <w:tcPr>
+            <w:tcW w:type="dxa" w:w="3135"/>
+          </w:tcPr>
+          <w:p>
+            <w:r>
+              <w:rPr>
+                <w:sz w:val="16"/>
+              </w:rPr>
+              <w:t>3,1 h</w:t>
             </w:r>
           </w:p>
         </w:tc>
@@ -7101,28 +7837,40 @@
       <w:tr>
         <w:tc>
           <w:tcPr>
-            <w:tcW w:type="dxa" w:w="4703"/>
-          </w:tcPr>
-          <w:p>
-            <w:r>
-              <w:rPr>
-                <w:sz w:val="16"/>
-              </w:rPr>
-              <w:t>Horas de parada não planejada evitáveis</w:t>
-            </w:r>
-          </w:p>
-        </w:tc>
-        <w:tc>
-          <w:tcPr>
-            <w:tcW w:type="dxa" w:w="4703"/>
-          </w:tcPr>
-          <w:p>
-            <w:r>
-              <w:rPr>
-                <w:b/>
-                <w:sz w:val="16"/>
-              </w:rPr>
-              <w:t>326,7 h</w:t>
+            <w:tcW w:type="dxa" w:w="3135"/>
+          </w:tcPr>
+          <w:p>
+            <w:r>
+              <w:rPr>
+                <w:sz w:val="16"/>
+              </w:rPr>
+              <w:t>Cartões de inspeção no mês</w:t>
+            </w:r>
+          </w:p>
+        </w:tc>
+        <w:tc>
+          <w:tcPr>
+            <w:tcW w:type="dxa" w:w="3135"/>
+          </w:tcPr>
+          <w:p>
+            <w:r>
+              <w:rPr>
+                <w:sz w:val="16"/>
+              </w:rPr>
+              <w:t>5.725 (~191/dia)</w:t>
+            </w:r>
+          </w:p>
+        </w:tc>
+        <w:tc>
+          <w:tcPr>
+            <w:tcW w:type="dxa" w:w="3135"/>
+          </w:tcPr>
+          <w:p>
+            <w:r>
+              <w:rPr>
+                <w:sz w:val="16"/>
+              </w:rPr>
+              <w:t>1.340 (~45/dia)</w:t>
             </w:r>
           </w:p>
         </w:tc>
@@ -7130,27 +7878,40 @@
       <w:tr>
         <w:tc>
           <w:tcPr>
-            <w:tcW w:type="dxa" w:w="4703"/>
-          </w:tcPr>
-          <w:p>
-            <w:r>
-              <w:rPr>
-                <w:sz w:val="16"/>
-              </w:rPr>
-              <w:t>Benefício bruto estimado</w:t>
-            </w:r>
-          </w:p>
-        </w:tc>
-        <w:tc>
-          <w:tcPr>
-            <w:tcW w:type="dxa" w:w="4703"/>
-          </w:tcPr>
-          <w:p>
-            <w:r>
-              <w:rPr>
-                <w:sz w:val="16"/>
-              </w:rPr>
-              <w:t>R$ 1,96 mi</w:t>
+            <w:tcW w:type="dxa" w:w="3135"/>
+          </w:tcPr>
+          <w:p>
+            <w:r>
+              <w:rPr>
+                <w:sz w:val="16"/>
+              </w:rPr>
+              <w:t>Horas de parada evitáveis</w:t>
+            </w:r>
+          </w:p>
+        </w:tc>
+        <w:tc>
+          <w:tcPr>
+            <w:tcW w:type="dxa" w:w="3135"/>
+          </w:tcPr>
+          <w:p>
+            <w:r>
+              <w:rPr>
+                <w:sz w:val="16"/>
+              </w:rPr>
+              <w:t>369,0 h</w:t>
+            </w:r>
+          </w:p>
+        </w:tc>
+        <w:tc>
+          <w:tcPr>
+            <w:tcW w:type="dxa" w:w="3135"/>
+          </w:tcPr>
+          <w:p>
+            <w:r>
+              <w:rPr>
+                <w:sz w:val="16"/>
+              </w:rPr>
+              <w:t>242,1 h</w:t>
             </w:r>
           </w:p>
         </w:tc>
@@ -7158,27 +7919,40 @@
       <w:tr>
         <w:tc>
           <w:tcPr>
-            <w:tcW w:type="dxa" w:w="4703"/>
-          </w:tcPr>
-          <w:p>
-            <w:r>
-              <w:rPr>
-                <w:sz w:val="16"/>
-              </w:rPr>
-              <w:t>Custo das 2.566 inspeções vazias</w:t>
-            </w:r>
-          </w:p>
-        </w:tc>
-        <w:tc>
-          <w:tcPr>
-            <w:tcW w:type="dxa" w:w="4703"/>
-          </w:tcPr>
-          <w:p>
-            <w:r>
-              <w:rPr>
-                <w:sz w:val="16"/>
-              </w:rPr>
-              <w:t>R$ 1,15 mi</w:t>
+            <w:tcW w:type="dxa" w:w="3135"/>
+          </w:tcPr>
+          <w:p>
+            <w:r>
+              <w:rPr>
+                <w:sz w:val="16"/>
+              </w:rPr>
+              <w:t>Benefício bruto</w:t>
+            </w:r>
+          </w:p>
+        </w:tc>
+        <w:tc>
+          <w:tcPr>
+            <w:tcW w:type="dxa" w:w="3135"/>
+          </w:tcPr>
+          <w:p>
+            <w:r>
+              <w:rPr>
+                <w:sz w:val="16"/>
+              </w:rPr>
+              <w:t>R$ 2,21 mi</w:t>
+            </w:r>
+          </w:p>
+        </w:tc>
+        <w:tc>
+          <w:tcPr>
+            <w:tcW w:type="dxa" w:w="3135"/>
+          </w:tcPr>
+          <w:p>
+            <w:r>
+              <w:rPr>
+                <w:sz w:val="16"/>
+              </w:rPr>
+              <w:t>R$ 1,45 mi</w:t>
             </w:r>
           </w:p>
         </w:tc>
@@ -7186,7 +7960,48 @@
       <w:tr>
         <w:tc>
           <w:tcPr>
-            <w:tcW w:type="dxa" w:w="4703"/>
+            <w:tcW w:type="dxa" w:w="3135"/>
+          </w:tcPr>
+          <w:p>
+            <w:r>
+              <w:rPr>
+                <w:sz w:val="16"/>
+              </w:rPr>
+              <w:t>Custo das inspeções vazias</w:t>
+            </w:r>
+          </w:p>
+        </w:tc>
+        <w:tc>
+          <w:tcPr>
+            <w:tcW w:type="dxa" w:w="3135"/>
+          </w:tcPr>
+          <w:p>
+            <w:r>
+              <w:rPr>
+                <w:sz w:val="16"/>
+              </w:rPr>
+              <w:t>R$ 2,09 mi</w:t>
+            </w:r>
+          </w:p>
+        </w:tc>
+        <w:tc>
+          <w:tcPr>
+            <w:tcW w:type="dxa" w:w="3135"/>
+          </w:tcPr>
+          <w:p>
+            <w:r>
+              <w:rPr>
+                <w:sz w:val="16"/>
+              </w:rPr>
+              <w:t>R$ 0,35 mi</w:t>
+            </w:r>
+          </w:p>
+        </w:tc>
+      </w:tr>
+      <w:tr>
+        <w:tc>
+          <w:tcPr>
+            <w:tcW w:type="dxa" w:w="3135"/>
           </w:tcPr>
           <w:p>
             <w:r>
@@ -7194,13 +8009,26 @@
                 <w:b/>
                 <w:sz w:val="16"/>
               </w:rPr>
-              <w:t>Benefício líquido estimado no mês</w:t>
-            </w:r>
-          </w:p>
-        </w:tc>
-        <w:tc>
-          <w:tcPr>
-            <w:tcW w:type="dxa" w:w="4703"/>
+              <w:t>Benefício líquido no mês</w:t>
+            </w:r>
+          </w:p>
+        </w:tc>
+        <w:tc>
+          <w:tcPr>
+            <w:tcW w:type="dxa" w:w="3135"/>
+          </w:tcPr>
+          <w:p>
+            <w:r>
+              <w:rPr>
+                <w:sz w:val="16"/>
+              </w:rPr>
+              <w:t>R$ 119 mil</w:t>
+            </w:r>
+          </w:p>
+        </w:tc>
+        <w:tc>
+          <w:tcPr>
+            <w:tcW w:type="dxa" w:w="3135"/>
           </w:tcPr>
           <w:p>
             <w:r>
@@ -7208,7 +8036,7 @@
                 <w:b/>
                 <w:sz w:val="16"/>
               </w:rPr>
-              <w:t>R$ 805 mil</w:t>
+              <w:t>R$ 1,10 mi</w:t>
             </w:r>
           </w:p>
         </w:tc>
@@ -7220,31 +8048,16 @@
         <w:jc w:val="both"/>
       </w:pPr>
       <w:r>
+        <w:t xml:space="preserve">A leitura é operacional: com equipe de inspeção folgada (ou inspeções acopladas ao abastecimento), o ponto F2 captura mais alertas e ainda se paga; com equipe restrita, o ponto custo-ótimo entrega </w:t>
+      </w:r>
+      <w:r>
         <w:rPr>
           <w:b/>
         </w:rPr>
-        <w:t>Aferição da métrica de sucesso (CM 1.2):</w:t>
-      </w:r>
-      <w:r>
-        <w:t xml:space="preserve"> a meta de antecipação foi atingida (60,7% ≥ 60%); a meta de precisão </w:t>
-      </w:r>
-      <w:r>
-        <w:rPr>
-          <w:b/>
-        </w:rPr>
-        <w:t>não</w:t>
-      </w:r>
-      <w:r>
-        <w:t xml:space="preserve"> foi atingida no limiar F2 (24,5% &lt; 30%). Operar no limiar de precisão 30% é possível (limiar 0,070), mas derruba o recall para 38,8% e a antecipação abaixo da meta — com esta base, as duas metas não são atingíveis simultaneamente, e o ponto F2 é o que maximiza o benefício líquido estimado. Registra-se a meta como </w:t>
-      </w:r>
-      <w:r>
-        <w:rPr>
-          <w:b/>
-        </w:rPr>
-        <w:t>parcialmente atingida</w:t>
-      </w:r>
-      <w:r>
-        <w:t>, com o trade-off quantificado para decisão do negócio.</w:t>
+        <w:t>R$ 1,10 milhão/mês líquidos</w:t>
+      </w:r>
+      <w:r>
+        <w:t xml:space="preserve"> com um cartão por equipamento-dia. O painel pode expor os dois níveis como "atenção" (F2) e "inspecionar agora" (custo-ótimo) — o mesmo score, duas ações.</w:t>
       </w:r>
     </w:p>
     <w:p>
@@ -7255,6 +8068,29 @@
         <w:rPr>
           <w:b/>
         </w:rPr>
+        <w:t>Aferição da métrica de sucesso (CM 1.2):</w:t>
+      </w:r>
+      <w:r>
+        <w:t xml:space="preserve"> as duas metas não são atingíveis simultaneamente com esta base — o ponto F2 atinge a meta de antecipação (68,6% ≥ 60%) mas não a de precisão (18,7% &lt; 30%); o ponto custo-ótimo atinge a de precisão (41,9% ≥ 30%) mas não a de antecipação (45,0% &lt; 60%). Registra-se a meta como </w:t>
+      </w:r>
+      <w:r>
+        <w:rPr>
+          <w:b/>
+        </w:rPr>
+        <w:t>parcialmente atingida em cada ponto</w:t>
+      </w:r>
+      <w:r>
+        <w:t>, com o trade-off completo quantificado em R$ para decisão do negócio — mais útil que um único número que esconderia a escolha.</w:t>
+      </w:r>
+    </w:p>
+    <w:p>
+      <w:pPr>
+        <w:jc w:val="both"/>
+      </w:pPr>
+      <w:r>
+        <w:rPr>
+          <w:b/>
+        </w:rPr>
         <w:t>Insights não óbvios:</w:t>
       </w:r>
     </w:p>
@@ -7321,7 +8157,7 @@
         <w:t>O precursor depende do subsistema, não só do evento.</w:t>
       </w:r>
       <w:r>
-        <w:t xml:space="preserve"> Temperatura de freio dianteiro direito: 87% de recall; freios traseiros: ~20%. Mesma física, instrumentação/dinâmica diferentes — mapa direto para priorizar melhorias de sensores.</w:t>
+        <w:t xml:space="preserve"> Temperatura de freio dianteiro direito: 94% de recall; freios traseiros: ~33%. Mesma física, instrumentação/dinâmica diferentes — mapa direto para priorizar melhorias de sensores.</w:t>
       </w:r>
     </w:p>
     <w:p>
@@ -7414,16 +8250,7 @@
         <w:t>"Quais equipamentos têm maior risco de gerar um alerta don't go nas próximas 4 horas?"</w:t>
       </w:r>
       <w:r>
-        <w:t xml:space="preserve"> — a pergunta foi respondida com um pipeline reprodutível que, a cada fechamento de ciclo, ranqueia a frota por probabilidade de alerta: no teste cego (jun/2025), o ranking tem AUC-ROC 0,864/AUC-PR 0,317 (9,6× a prevalência), antecipou </w:t>
-      </w:r>
-      <w:r>
-        <w:rPr>
-          <w:b/>
-        </w:rPr>
-        <w:t>60,7% dos alertas</w:t>
-      </w:r>
-      <w:r>
-        <w:t xml:space="preserve"> com mediana de 3,2 h de aviso e precisão de 24,5% no limiar F2 — atingindo a meta de antecipação e ficando aquém da meta de precisão, com o trade-off entre os dois pontos de operação quantificado (seção 4.6). O modelo aprendeu mecanismos com respaldo físico (recorrência, rajadas de alarmes monitorados, efeito equipamento e operador), verificados por SHAP.</w:t>
+        <w:t xml:space="preserve"> — a pergunta foi respondida com um pipeline reprodutível que, a cada fechamento de ciclo, ranqueia a frota por probabilidade de alerta: no teste cego (jun/2025), o ranking tem AUC-ROC 0,870 (RF: AUC-PR 0,320; 9× a prevalência) e opera em dois pontos escolhidos na validação — captura (68,6% dos alertas antecipados, mediana de 3,4 h de aviso) e custo-ótimo (precisão de 41,9% e benefício líquido de R$ 1,10 mi/mês). O modelo aprendeu mecanismos com respaldo físico (recorrência, rajadas de alarmes monitorados, efeito equipamento e operador), verificados por duas vias independentes — SHAP no classificador e fatores de aceleração no modelo de sobrevivência.</w:t>
       </w:r>
     </w:p>
     <w:p>
@@ -7446,7 +8273,7 @@
         <w:t>derivado</w:t>
       </w:r>
       <w:r>
-        <w:t xml:space="preserve"> da telemetria (tolerância de 6 h) — 18,6% dos ciclos ficaram sem operador, concentrados em 15 Tags sem telemetria, cujas decisões nunca podem ser positivas (viés estrutural documentado); (iv) telemetria agregada em eventos, sem as séries contínuas de sensores, que elevariam o teto de desempenho; (v) o campeão é um modelo deliberadamente compacto (3 árvores) selecionado sob drift de prevalência em maio — com re-treino mensal, modelos maiores tendem a se sustentar; (vi) premissas financeiras (R$ 6.000/h, 35% de economia) são estimativas de ordem de grandeza a calibrar com a área de planejamento; (vii) generalização para outras localidades exige re-treino — os padrões aprendidos são específicos desta frota e catálogo.</w:t>
+        <w:t xml:space="preserve"> da telemetria (tolerância de 6 h) — 18,6% dos ciclos ficaram sem operador, concentrados em 15 Tags sem telemetria, cujas decisões nunca podem ser positivas (viés estrutural documentado); (iv) telemetria agregada em eventos, sem as séries contínuas de sensores, que elevariam o teto de desempenho; (v) o campeão é um modelo deliberadamente compacto (3 árvores, mesmo com tuning em duas janelas) — o score resultante é granular (533 valores distintos no teste), suficiente para fila e limiares, mas não para probabilidades calibradas finas; (vi) premissas financeiras (R$ 6.000/h, 35% de economia) são estimativas de ordem de grandeza a calibrar com a área de planejamento — o limiar custo-ótimo herda essa incerteza; (vii) generalização para outras localidades exige re-treino — os padrões aprendidos são específicos desta frota e catálogo.</w:t>
       </w:r>
     </w:p>
     <w:p>
@@ -7473,14 +8300,14 @@
         <w:t>Novos dados:</w:t>
       </w:r>
       <w:r>
-        <w:t xml:space="preserve"> integrar ordens de serviço do ERP de manutenção (causa raiz real, componente trocado, horímetro) para separar "alerta antecipável" de "manutenção mal executada" — o peso da recorrência no SHAP sugere que parte do problema é de qualidade de intervenção; além de dados climáticos horários e séries contínuas de sensores via historiador (crucial para os eventos de nível sem rampa, como </w:t>
+        <w:t xml:space="preserve"> integrar ordens de serviço do ERP de manutenção (causa raiz real, componente trocado, horímetro) para separar "alerta antecipável" de "manutenção mal executada" — o peso da recorrência no SHAP e no AFT sugere que parte do problema é de qualidade de intervenção; além de dados climáticos horários e séries contínuas de sensores via historiador (crucial para os eventos de nível sem rampa, como </w:t>
       </w:r>
       <w:r>
         <w:rPr>
           <w:rFonts w:ascii="Consolas" w:hAnsi="Consolas"/>
           <w:sz w:val="18"/>
         </w:rPr>
-        <w:t>Transmission Oil Level</w:t>
+        <w:t>Aftercooler Level</w:t>
       </w:r>
       <w:r>
         <w:t>).</w:t>
@@ -7497,16 +8324,16 @@
         <w:t>Novas features / formulação:</w:t>
       </w:r>
       <w:r>
-        <w:t xml:space="preserve"> duas cabeças complementares — regressão/sobrevivência (Weibull AFT ou Cox com censura, tempo-até-alerta por subsistema) para priorização fina além do binário 4 h; e classificação multi-rótulo do </w:t>
+        <w:t xml:space="preserve"> evoluir o Weibull AFT para </w:t>
       </w:r>
       <w:r>
         <w:rPr>
           <w:b/>
         </w:rPr>
-        <w:t>tipo</w:t>
-      </w:r>
-      <w:r>
-        <w:t xml:space="preserve"> de alerta (freio vs. nível vs. arrefecimento), entregando à manutenção o subsistema suspeito junto com o cartão.</w:t>
+        <w:t>sobrevivência por subsistema</w:t>
+      </w:r>
+      <w:r>
+        <w:t xml:space="preserve"> (riscos competitivos: freio vs. nível vs. arrefecimento — qual falha vem primeiro?) e classificação multi-rótulo do tipo de alerta, entregando à manutenção o subsistema suspeito junto com o cartão; sensorização dirigida para os pontos cegos mapeados (freios traseiros, L-1850).</w:t>
       </w:r>
     </w:p>
     <w:p>
@@ -7520,7 +8347,7 @@
         <w:t>Abordagens alternativas:</w:t>
       </w:r>
       <w:r>
-        <w:t xml:space="preserve"> aprendizado online (re-treino incremental semanal com monitoramento de prevalência e AUC-PR móvel — a rotina de degradação temporal da seção 4.2 já é o embrião, e a queda da 2ª quinzena de maio mostra por que é necessária) e custo-sensível explícito (otimizar diretamente o benefício líquido em R$ em vez de F2).</w:t>
+        <w:t xml:space="preserve"> aprendizado online (re-treino incremental semanal com monitoramento de prevalência e AUC-PR móvel — a rotina de degradação temporal da seção 4.2 já é o embrião, e a queda da 2ª quinzena de maio mostra por que é necessária) e calibração de probabilidades (isotônica) sobre o score granular, refinando o limiar custo-ótimo já implementado.</w:t>
       </w:r>
     </w:p>
     <w:p>
@@ -7534,7 +8361,7 @@
         <w:t>Integração operacional:</w:t>
       </w:r>
       <w:r>
-        <w:t xml:space="preserve"> publicar o score via API no sistema de despacho com atualização por evento (a arquitetura de janelas ordenadas migra direto para streaming), cartões com as evidências SHAP, semáforo do K-Means como camada de leitura rápida (o cluster pré-falha tem 84% de acerto), watchdog de flooding de telemetria (cluster 3), e ciclo de feedback do inspetor (achou/não achou problema) realimentando o treino — transformando cada falso positivo em rótulo novo.</w:t>
+        <w:t xml:space="preserve"> publicar o score via API no sistema de despacho com atualização por evento (a arquitetura de janelas ordenadas migra direto para streaming), cartões em dois níveis ("atenção"/"inspecionar agora", seção 4.6) com as evidências SHAP, semáforo do K-Means como camada de leitura rápida (o cluster pré-falha tem 84% de acerto), watchdog de flooding de telemetria (cluster 3), e ciclo de feedback do inspetor (achou/não achou problema) realimentando o treino — transformando cada falso positivo em rótulo novo.</w:t>
       </w:r>
     </w:p>
     <w:p>
@@ -7610,6 +8437,14 @@
       </w:pPr>
       <w:r>
         <w:t>SHAP — https://shap.readthedocs.io</w:t>
+      </w:r>
+    </w:p>
+    <w:p>
+      <w:pPr>
+        <w:pStyle w:val="ListBullet"/>
+      </w:pPr>
+      <w:r>
+        <w:t>lifelines (análise de sobrevivência) — https://lifelines.readthedocs.io</w:t>
       </w:r>
     </w:p>
     <w:p>

</xml_diff>

<commit_message>
Atualiza autores e contatos na capa do relatório
</commit_message>
<xml_diff>
--- a/relatorio/Relatorio_Final.docx
+++ b/relatorio/Relatorio_Final.docx
@@ -98,7 +98,53 @@
           <w:color w:val="1A1A1A"/>
           <w:sz w:val="24"/>
         </w:rPr>
-        <w:t>pedrojoaao4@gmail.com</w:t>
+        <w:t>costa.j13@yahoo.com</w:t>
+      </w:r>
+    </w:p>
+    <w:p>
+      <w:pPr>
+        <w:pStyle w:val="BodyText"/>
+        <w:spacing w:before="480"/>
+        <w:jc w:val="center"/>
+      </w:pPr>
+      <w:r>
+        <w:rPr>
+          <w:rFonts w:ascii="Arial" w:hAnsi="Arial"/>
+          <w:b/>
+          <w:color w:val="1A1A1A"/>
+          <w:sz w:val="28"/>
+        </w:rPr>
+        <w:t>Pedro Henrique Santos</w:t>
+      </w:r>
+    </w:p>
+    <w:p>
+      <w:pPr>
+        <w:pStyle w:val="BodyText"/>
+        <w:jc w:val="center"/>
+      </w:pPr>
+      <w:r>
+        <w:rPr>
+          <w:rFonts w:ascii="Arial" w:hAnsi="Arial"/>
+          <w:b w:val="0"/>
+          <w:color w:val="1A1A1A"/>
+          <w:sz w:val="24"/>
+        </w:rPr>
+        <w:t>Universidade Federal de Minas Gerais (UFMG)</w:t>
+      </w:r>
+    </w:p>
+    <w:p>
+      <w:pPr>
+        <w:pStyle w:val="BodyText"/>
+        <w:jc w:val="center"/>
+      </w:pPr>
+      <w:r>
+        <w:rPr>
+          <w:rFonts w:ascii="Arial" w:hAnsi="Arial"/>
+          <w:b w:val="0"/>
+          <w:color w:val="1A1A1A"/>
+          <w:sz w:val="24"/>
+        </w:rPr>
+        <w:t>pedro.hsdo2025@gmail.com</w:t>
       </w:r>
     </w:p>
     <w:p>

</xml_diff>